<commit_message>
fix: complete contract MVP production readiness
Co-authored-by: Cursor <cursoragent@cursor.com>
</commit_message>
<xml_diff>
--- a/server/contract-templates/v1/legal.docx
+++ b/server/contract-templates/v1/legal.docx
@@ -65,7 +65,7 @@
         <w:rPr>
           <w:spacing w:val="40"/>
         </w:rPr>
-        <w:t>{{propertyAddress}}да жойлашган бино эгаси {{lessorFullName}} (паспорт {{lessorPassport}}) (кейинги ўринларда “ИЖАРАГА БЕРУВЧИ” деб юритилади) хамда иккинчи томондан "{{companyFullName}}" {{legalForm}} {{authorityBasis}} асосида иш юритувчи жамият директори {{directorFullName}} (кейинги ўринларда “ИЖАРАГА ОЛУВЧИ” деб юритилади) иккинчи томондан, ушбу шартномани куйидагилар тугрисида туздик ({{tenantType}}):</w:t>
+        <w:t>{{propertyAddress}}да жойлашган бино эгаси {{lessorFullName}} (паспорт {{lessorPassport}}) (кейинги ўринларда “ИЖАРАГА БЕРУВЧИ” деб юритилади) ҳамда иккинчи томондан "{{companyFullName}}" {{legalForm}} {{authorityBasis}} асосида иш юритувчи жамият директори {{directorFullName}} (кейинги ўринларда “ИЖАРАГА ОЛУВЧИ” деб юритилади) ушбу шартномани қуйидагилар тўғрисида туздик ({{tenantType}}):</w:t>
       </w:r>
     </w:p>
     <w:p>
@@ -86,19 +86,7 @@
         <w:rPr>
           <w:spacing w:val="-4"/>
         </w:rPr>
-        <w:t>ШАРТНОМА</w:t>
-      </w:r>
-      <w:r>
-        <w:rPr>
-          <w:spacing w:val="-3"/>
-        </w:rPr>
-        <w:t xml:space="preserve"> </w:t>
-      </w:r>
-      <w:r>
-        <w:rPr>
-          <w:spacing w:val="-2"/>
-        </w:rPr>
-        <w:t>ПРЕДМЕТИ</w:t>
+        <w:t>1. ШАРТНОМА ПРЕДМЕТИ</w:t>
       </w:r>
     </w:p>
     <w:p>
@@ -130,7 +118,7 @@
         <w:rPr>
           <w:spacing w:val="-11"/>
         </w:rPr>
-        <w:t>метр кватадрат (хона: {{roomName}}) майдонини “ИЖАРАГА ОЛУВЧИ” га шартноманинг 2.1-бандида кўрсатилган нархлар эвазига ижарага беради. “ИЖАРАГА ОЛУВЧИ” эса кўрсатилган хизматлар ҳақини шартномада белгиланган муддатлар ва ҳажмларда тўлайди.</w:t>
+        <w:t>метр квадрат (хона: {{roomName}}) майдонини “ИЖАРАГА ОЛУВЧИ” га шартноманинг 2.1-бандида кўрсатилган нархлар эвазига ижарага беради. “ИЖАРАГА ОЛУВЧИ” эса кўрсатилган хизматлар ҳақини шартномада белгиланган муддатлар ва ҳажмларда тўлайди.</w:t>
       </w:r>
     </w:p>
     <w:p>
@@ -151,13 +139,7 @@
         <w:rPr>
           <w:spacing w:val="-5"/>
         </w:rPr>
-        <w:t xml:space="preserve">ИЖАРА </w:t>
-      </w:r>
-      <w:r>
-        <w:rPr>
-          <w:spacing w:val="-2"/>
-        </w:rPr>
-        <w:t>НАРХИ</w:t>
+        <w:t>2. ИЖАРА НАРХИ</w:t>
       </w:r>
     </w:p>
     <w:tbl>
@@ -854,277 +836,10 @@
         <w:ind w:right="66"/>
       </w:pPr>
       <w:r>
-        <w:t>2.2</w:t>
-      </w:r>
-      <w:r>
-        <w:rPr>
-          <w:spacing w:val="-4"/>
-        </w:rPr>
-        <w:t xml:space="preserve"> </w:t>
-      </w:r>
-      <w:r>
-        <w:t>Бир</w:t>
-      </w:r>
-      <w:r>
-        <w:rPr>
-          <w:spacing w:val="-4"/>
-        </w:rPr>
-        <w:t xml:space="preserve"> </w:t>
-      </w:r>
-      <w:r>
-        <w:t>метр</w:t>
-      </w:r>
-      <w:r>
-        <w:rPr>
-          <w:spacing w:val="-4"/>
-        </w:rPr>
-        <w:t xml:space="preserve"> </w:t>
-      </w:r>
-      <w:r>
-        <w:t>квадрат</w:t>
-      </w:r>
-      <w:r>
-        <w:rPr>
-          <w:spacing w:val="-4"/>
-        </w:rPr>
-        <w:t xml:space="preserve"> </w:t>
-      </w:r>
-      <w:r>
-        <w:t>учун</w:t>
-      </w:r>
-      <w:r>
-        <w:rPr>
-          <w:spacing w:val="-6"/>
-        </w:rPr>
-        <w:t xml:space="preserve"> </w:t>
-      </w:r>
-      <w:r>
-        <w:t>белиланган</w:t>
-      </w:r>
-      <w:r>
-        <w:rPr>
-          <w:spacing w:val="-5"/>
-        </w:rPr>
-        <w:t xml:space="preserve"> </w:t>
-      </w:r>
-      <w:r>
-        <w:t>хизмат</w:t>
-      </w:r>
-      <w:r>
-        <w:rPr>
-          <w:spacing w:val="-5"/>
-        </w:rPr>
-        <w:t xml:space="preserve"> </w:t>
-      </w:r>
-      <w:r>
-        <w:t>хақи</w:t>
-      </w:r>
-      <w:r>
-        <w:rPr>
-          <w:spacing w:val="-6"/>
-        </w:rPr>
-        <w:t xml:space="preserve"> </w:t>
-      </w:r>
-      <w:r>
-        <w:t>жисмоний</w:t>
-      </w:r>
-      <w:r>
-        <w:rPr>
-          <w:spacing w:val="-6"/>
-        </w:rPr>
-        <w:t xml:space="preserve"> </w:t>
-      </w:r>
-      <w:r>
-        <w:t>шахслардан</w:t>
-      </w:r>
-      <w:r>
-        <w:rPr>
-          <w:spacing w:val="-11"/>
-        </w:rPr>
-        <w:t xml:space="preserve"> </w:t>
-      </w:r>
-      <w:r>
-        <w:t>олинадиган</w:t>
-      </w:r>
-      <w:r>
-        <w:rPr>
-          <w:spacing w:val="-8"/>
-        </w:rPr>
-        <w:t xml:space="preserve"> </w:t>
-      </w:r>
-      <w:r>
-        <w:t>даромад</w:t>
-      </w:r>
-      <w:r>
-        <w:rPr>
-          <w:spacing w:val="-8"/>
-        </w:rPr>
-        <w:t xml:space="preserve"> </w:t>
-      </w:r>
-      <w:r>
-        <w:t>солиғини</w:t>
-      </w:r>
-      <w:r>
-        <w:rPr>
-          <w:spacing w:val="-11"/>
-        </w:rPr>
-        <w:t xml:space="preserve"> </w:t>
-      </w:r>
-      <w:r>
-        <w:t>ўз</w:t>
-      </w:r>
-      <w:r>
-        <w:rPr>
-          <w:spacing w:val="-5"/>
-        </w:rPr>
-        <w:t xml:space="preserve"> </w:t>
-      </w:r>
-      <w:r>
-        <w:t>ичига</w:t>
-      </w:r>
-      <w:r>
-        <w:rPr>
-          <w:spacing w:val="-4"/>
-        </w:rPr>
-        <w:t xml:space="preserve"> </w:t>
-      </w:r>
-      <w:r>
-        <w:t>олади.</w:t>
-      </w:r>
-      <w:r>
-        <w:rPr>
-          <w:spacing w:val="-5"/>
-        </w:rPr>
-        <w:t xml:space="preserve"> </w:t>
-      </w:r>
-      <w:r>
-        <w:t>Ўзбекистон</w:t>
-      </w:r>
-      <w:r>
-        <w:rPr>
-          <w:spacing w:val="-8"/>
-        </w:rPr>
-        <w:t xml:space="preserve"> </w:t>
-      </w:r>
-      <w:r>
-        <w:t>Республикаси Солиқ</w:t>
-      </w:r>
-      <w:r>
-        <w:rPr>
-          <w:spacing w:val="-5"/>
-        </w:rPr>
-        <w:t xml:space="preserve"> </w:t>
-      </w:r>
-      <w:r>
-        <w:t>кодексининг</w:t>
-      </w:r>
-      <w:r>
-        <w:rPr>
-          <w:spacing w:val="-3"/>
-        </w:rPr>
-        <w:t xml:space="preserve"> </w:t>
-      </w:r>
-      <w:r>
-        <w:t>388-моддасига</w:t>
-      </w:r>
-      <w:r>
-        <w:rPr>
-          <w:spacing w:val="-4"/>
-        </w:rPr>
-        <w:t xml:space="preserve"> </w:t>
-      </w:r>
-      <w:r>
-        <w:t>асосан</w:t>
-      </w:r>
-      <w:r>
-        <w:rPr>
-          <w:spacing w:val="-3"/>
-        </w:rPr>
-        <w:t xml:space="preserve"> </w:t>
-      </w:r>
-      <w:r>
-        <w:t>Солиқ</w:t>
-      </w:r>
-      <w:r>
-        <w:rPr>
-          <w:spacing w:val="-3"/>
-        </w:rPr>
-        <w:t xml:space="preserve"> </w:t>
-      </w:r>
-      <w:r>
-        <w:t>агенти</w:t>
-      </w:r>
-      <w:r>
-        <w:rPr>
-          <w:spacing w:val="-2"/>
-        </w:rPr>
-        <w:t xml:space="preserve"> </w:t>
-      </w:r>
-      <w:r>
-        <w:t>ҳисобланган</w:t>
-      </w:r>
-      <w:r>
-        <w:rPr>
-          <w:spacing w:val="-3"/>
-        </w:rPr>
-        <w:t xml:space="preserve"> </w:t>
-      </w:r>
-      <w:r>
-        <w:t>“ИЖАРАГА</w:t>
-      </w:r>
-      <w:r>
-        <w:rPr>
-          <w:spacing w:val="-7"/>
-        </w:rPr>
-        <w:t xml:space="preserve"> </w:t>
-      </w:r>
-      <w:r>
-        <w:t>ОЛУВЧИ”</w:t>
-      </w:r>
-      <w:r>
-        <w:rPr>
-          <w:spacing w:val="-4"/>
-        </w:rPr>
-        <w:t xml:space="preserve"> </w:t>
-      </w:r>
-      <w:r>
-        <w:t>солиқ</w:t>
-      </w:r>
-      <w:r>
-        <w:rPr>
-          <w:spacing w:val="-4"/>
-        </w:rPr>
-        <w:t xml:space="preserve"> </w:t>
-      </w:r>
-      <w:r>
-        <w:t>тўловчининг</w:t>
-      </w:r>
-      <w:r>
-        <w:rPr>
-          <w:spacing w:val="-2"/>
-        </w:rPr>
-        <w:t xml:space="preserve"> </w:t>
-      </w:r>
-      <w:r>
-        <w:t>ушбу</w:t>
-      </w:r>
-      <w:r>
-        <w:rPr>
-          <w:spacing w:val="-3"/>
-        </w:rPr>
-        <w:t xml:space="preserve"> </w:t>
-      </w:r>
-      <w:r>
-        <w:t>Кодекснинг</w:t>
-      </w:r>
-      <w:r>
-        <w:rPr>
-          <w:spacing w:val="-4"/>
-        </w:rPr>
-        <w:t xml:space="preserve"> </w:t>
-      </w:r>
-      <w:r>
-        <w:t>387-моддасида кўрсатилган даромадларидан ҳисобланган солиқ суммасини ушлаб қолиши шарт ва ушбу сумма Солиқ агентининг солиқ солинадиган даромадларига киради.</w:t>
+        <w:rPr>
+          <w:spacing w:val="-4"/>
+        </w:rPr>
+        <w:t>2.2 Бир метр квадрат учун белгиланган хизмат ҳақи жисмоний шахслардан олинадиган даромад солиғини ўз ичига олади. Ўзбекистон Республикаси Солиқ кодексининг 388-моддасига асосан Солиқ агенти ҳисобланган “ИЖАРАГА ОЛУВЧИ” солиқ тўловчининг ушбу Кодекснинг 387-моддасида кўрсатилган даромадларидан ҳисобланган солиқ суммасини ушлаб қолиши шарт ва ушбу сумма Солиқ агентининг солиқ солинадиган даромадларига киради.</w:t>
       </w:r>
     </w:p>
     <w:p>
@@ -1145,19 +860,7 @@
         <w:rPr>
           <w:spacing w:val="-4"/>
         </w:rPr>
-        <w:t>ЎЗАРО</w:t>
-      </w:r>
-      <w:r>
-        <w:rPr>
-          <w:spacing w:val="-6"/>
-        </w:rPr>
-        <w:t xml:space="preserve"> </w:t>
-      </w:r>
-      <w:r>
-        <w:rPr>
-          <w:spacing w:val="-4"/>
-        </w:rPr>
-        <w:t>ҲИСОБ-КИТОБЛАР ТАРТИБИ</w:t>
+        <w:t>3. ЎЗАРО ҲИСОБ-КИТОБЛАР ТАРТИБИ</w:t>
       </w:r>
     </w:p>
     <w:p>
@@ -1180,7 +883,7 @@
         <w:rPr>
           <w:sz w:val="20"/>
         </w:rPr>
-        <w:t>“ИЖАРАГА ОЛУВЧИ” ҳар ойлик кўрсатилган ижара хизмати учун “ИЖАРАГА БЕРУВЧИ” нинг шартномада кўрсатилган ҳисоб рақамига {{paymentDueDay}}- санасига кадар олдиндан туловларни амалга оширади. Агар бу кун банк иш кунига тўғри келмаса кейинги банк иш куни охирги тўлов санаси ҳисобланади</w:t>
+        <w:t>“ИЖАРАГА ОЛУВЧИ” ҳар ойлик кўрсатилган ижара хизмати учун “ИЖАРАГА БЕРУВЧИ” нинг шартномада кўрсатилган ҳисоб рақамига {{paymentDueDay}}- санасига қадар олдиндан тўловларни амалга оширади. Агар бу кун банк иш кунига тўғри келмаса кейинги банк иш куни охирги тўлов санаси ҳисобланади</w:t>
       </w:r>
     </w:p>
     <w:p>
@@ -1406,43 +1109,7 @@
         <w:rPr>
           <w:spacing w:val="-4"/>
         </w:rPr>
-        <w:t>ТАРАФЛАРНИНГ</w:t>
-      </w:r>
-      <w:r>
-        <w:rPr>
-          <w:spacing w:val="2"/>
-        </w:rPr>
-        <w:t xml:space="preserve"> </w:t>
-      </w:r>
-      <w:r>
-        <w:rPr>
-          <w:spacing w:val="-4"/>
-        </w:rPr>
-        <w:t>ҲУҚУҚ</w:t>
-      </w:r>
-      <w:r>
-        <w:rPr>
-          <w:spacing w:val="-1"/>
-        </w:rPr>
-        <w:t xml:space="preserve"> </w:t>
-      </w:r>
-      <w:r>
-        <w:rPr>
-          <w:spacing w:val="-4"/>
-        </w:rPr>
-        <w:t>ВА</w:t>
-      </w:r>
-      <w:r>
-        <w:rPr>
-          <w:spacing w:val="-3"/>
-        </w:rPr>
-        <w:t xml:space="preserve"> </w:t>
-      </w:r>
-      <w:r>
-        <w:rPr>
-          <w:spacing w:val="-4"/>
-        </w:rPr>
-        <w:t>МАЖБУРИЯТЛАРИ</w:t>
+        <w:t>4. ТАРАФЛАРНИНГ ҲУҚУҚ ВА МАЖБУРИЯТЛАРИ</w:t>
       </w:r>
     </w:p>
     <w:p>
@@ -1666,115 +1333,10 @@
         <w:spacing w:before="24" w:line="271" w:lineRule="auto"/>
       </w:pPr>
       <w:r>
-        <w:t>тармоқларидан,</w:t>
-      </w:r>
-      <w:r>
         <w:rPr>
           <w:spacing w:val="-13"/>
         </w:rPr>
-        <w:t xml:space="preserve"> </w:t>
-      </w:r>
-      <w:r>
-        <w:t>ижарага</w:t>
-      </w:r>
-      <w:r>
-        <w:rPr>
-          <w:spacing w:val="-12"/>
-        </w:rPr>
-        <w:t xml:space="preserve"> </w:t>
-      </w:r>
-      <w:r>
-        <w:t>олинган</w:t>
-      </w:r>
-      <w:r>
-        <w:rPr>
-          <w:spacing w:val="-13"/>
-        </w:rPr>
-        <w:t xml:space="preserve"> </w:t>
-      </w:r>
-      <w:r>
-        <w:t>ҳудуддан,</w:t>
-      </w:r>
-      <w:r>
-        <w:rPr>
-          <w:spacing w:val="-12"/>
-        </w:rPr>
-        <w:t xml:space="preserve"> </w:t>
-      </w:r>
-      <w:r>
-        <w:t>қурилмалардан</w:t>
-      </w:r>
-      <w:r>
-        <w:rPr>
-          <w:spacing w:val="-13"/>
-        </w:rPr>
-        <w:t xml:space="preserve"> </w:t>
-      </w:r>
-      <w:r>
-        <w:t>мақсадли</w:t>
-      </w:r>
-      <w:r>
-        <w:rPr>
-          <w:spacing w:val="-13"/>
-        </w:rPr>
-        <w:t xml:space="preserve"> </w:t>
-      </w:r>
-      <w:r>
-        <w:t>ва</w:t>
-      </w:r>
-      <w:r>
-        <w:rPr>
-          <w:spacing w:val="-12"/>
-        </w:rPr>
-        <w:t xml:space="preserve"> </w:t>
-      </w:r>
-      <w:r>
-        <w:t>оқилона</w:t>
-      </w:r>
-      <w:r>
-        <w:rPr>
-          <w:spacing w:val="-13"/>
-        </w:rPr>
-        <w:t xml:space="preserve"> </w:t>
-      </w:r>
-      <w:r>
-        <w:t>фойдаланилаётганини,</w:t>
-      </w:r>
-      <w:r>
-        <w:rPr>
-          <w:spacing w:val="-9"/>
-        </w:rPr>
-        <w:t xml:space="preserve"> </w:t>
-      </w:r>
-      <w:r>
-        <w:t>унинг</w:t>
-      </w:r>
-      <w:r>
-        <w:rPr>
-          <w:spacing w:val="-13"/>
-        </w:rPr>
-        <w:t xml:space="preserve"> </w:t>
-      </w:r>
-      <w:r>
-        <w:t>санитария-гигена</w:t>
-      </w:r>
-      <w:r>
-        <w:rPr>
-          <w:spacing w:val="-12"/>
-        </w:rPr>
-        <w:t xml:space="preserve"> </w:t>
-      </w:r>
-      <w:r>
-        <w:t>қоидаларига</w:t>
-      </w:r>
-      <w:r>
-        <w:rPr>
-          <w:spacing w:val="-9"/>
-        </w:rPr>
-        <w:t xml:space="preserve"> </w:t>
-      </w:r>
-      <w:r>
-        <w:t>риоя қилаётганлигини, шартнома билан расмийлаштирилмаган суб ИЖАРАГА ОЛУВЧИлар йўқлигини текшириш;</w:t>
+        <w:t>тармоқларидан, ижарага олинган ҳудуддан, қурилмалардан мақсадли ва оқилона фойдаланилаётганини, унинг санитария-гигиена қоидаларига риоя қилаётганлигини, шартнома билан расмийлаштирилмаган суб ИЖАРАГА ОЛУВЧИлар йўқлигини текшириш;</w:t>
       </w:r>
     </w:p>
     <w:p>
@@ -2750,332 +2312,7 @@
         <w:rPr>
           <w:sz w:val="20"/>
         </w:rPr>
-        <w:t>Коммунал</w:t>
-      </w:r>
-      <w:r>
-        <w:rPr>
-          <w:spacing w:val="-6"/>
-          <w:sz w:val="20"/>
-        </w:rPr>
-        <w:t xml:space="preserve"> </w:t>
-      </w:r>
-      <w:r>
-        <w:rPr>
-          <w:sz w:val="20"/>
-        </w:rPr>
-        <w:t>тармоқларда</w:t>
-      </w:r>
-      <w:r>
-        <w:rPr>
-          <w:spacing w:val="-6"/>
-          <w:sz w:val="20"/>
-        </w:rPr>
-        <w:t xml:space="preserve"> </w:t>
-      </w:r>
-      <w:r>
-        <w:rPr>
-          <w:sz w:val="20"/>
-        </w:rPr>
-        <w:t>авария</w:t>
-      </w:r>
-      <w:r>
-        <w:rPr>
-          <w:spacing w:val="-9"/>
-          <w:sz w:val="20"/>
-        </w:rPr>
-        <w:t xml:space="preserve"> </w:t>
-      </w:r>
-      <w:r>
-        <w:rPr>
-          <w:sz w:val="20"/>
-        </w:rPr>
-        <w:t>содир</w:t>
-      </w:r>
-      <w:r>
-        <w:rPr>
-          <w:spacing w:val="-5"/>
-          <w:sz w:val="20"/>
-        </w:rPr>
-        <w:t xml:space="preserve"> </w:t>
-      </w:r>
-      <w:r>
-        <w:rPr>
-          <w:sz w:val="20"/>
-        </w:rPr>
-        <w:t>бўлганидан</w:t>
-      </w:r>
-      <w:r>
-        <w:rPr>
-          <w:spacing w:val="-6"/>
-          <w:sz w:val="20"/>
-        </w:rPr>
-        <w:t xml:space="preserve"> </w:t>
-      </w:r>
-      <w:r>
-        <w:rPr>
-          <w:sz w:val="20"/>
-        </w:rPr>
-        <w:t>сўнг</w:t>
-      </w:r>
-      <w:r>
-        <w:rPr>
-          <w:spacing w:val="-2"/>
-          <w:sz w:val="20"/>
-        </w:rPr>
-        <w:t xml:space="preserve"> </w:t>
-      </w:r>
-      <w:r>
-        <w:rPr>
-          <w:sz w:val="20"/>
-        </w:rPr>
-        <w:t>уч</w:t>
-      </w:r>
-      <w:r>
-        <w:rPr>
-          <w:spacing w:val="-3"/>
-          <w:sz w:val="20"/>
-        </w:rPr>
-        <w:t xml:space="preserve"> </w:t>
-      </w:r>
-      <w:r>
-        <w:rPr>
-          <w:sz w:val="20"/>
-        </w:rPr>
-        <w:t>кунлик</w:t>
-      </w:r>
-      <w:r>
-        <w:rPr>
-          <w:spacing w:val="-9"/>
-          <w:sz w:val="20"/>
-        </w:rPr>
-        <w:t xml:space="preserve"> </w:t>
-      </w:r>
-      <w:r>
-        <w:rPr>
-          <w:sz w:val="20"/>
-        </w:rPr>
-        <w:t>муддат</w:t>
-      </w:r>
-      <w:r>
-        <w:rPr>
-          <w:spacing w:val="-6"/>
-          <w:sz w:val="20"/>
-        </w:rPr>
-        <w:t xml:space="preserve"> </w:t>
-      </w:r>
-      <w:r>
-        <w:rPr>
-          <w:sz w:val="20"/>
-        </w:rPr>
-        <w:t>ичида,</w:t>
-      </w:r>
-      <w:r>
-        <w:rPr>
-          <w:spacing w:val="-6"/>
-          <w:sz w:val="20"/>
-        </w:rPr>
-        <w:t xml:space="preserve"> </w:t>
-      </w:r>
-      <w:r>
-        <w:rPr>
-          <w:sz w:val="20"/>
-        </w:rPr>
-        <w:t>санитария-гигена,</w:t>
-      </w:r>
-      <w:r>
-        <w:rPr>
-          <w:spacing w:val="-5"/>
-          <w:sz w:val="20"/>
-        </w:rPr>
-        <w:t xml:space="preserve"> </w:t>
-      </w:r>
-      <w:r>
-        <w:rPr>
-          <w:sz w:val="20"/>
-        </w:rPr>
-        <w:t>коммунал</w:t>
-      </w:r>
-      <w:r>
-        <w:rPr>
-          <w:spacing w:val="-4"/>
-          <w:sz w:val="20"/>
-        </w:rPr>
-        <w:t xml:space="preserve"> </w:t>
-      </w:r>
-      <w:r>
-        <w:rPr>
-          <w:sz w:val="20"/>
-        </w:rPr>
-        <w:t>тармоқларда</w:t>
-      </w:r>
-      <w:r>
-        <w:rPr>
-          <w:spacing w:val="-6"/>
-          <w:sz w:val="20"/>
-        </w:rPr>
-        <w:t xml:space="preserve"> </w:t>
-      </w:r>
-      <w:r>
-        <w:rPr>
-          <w:sz w:val="20"/>
-        </w:rPr>
-        <w:t>профилактик тадбирлар ўтказилишида олдиндан 2 иш кунида “ИЖАРАГА ОЛУВЧИ” ни оғзаки равишда хабардор қилиш (Электр энергияси марказлаштирилган</w:t>
-      </w:r>
-      <w:r>
-        <w:rPr>
-          <w:spacing w:val="-13"/>
-          <w:sz w:val="20"/>
-        </w:rPr>
-        <w:t xml:space="preserve"> </w:t>
-      </w:r>
-      <w:r>
-        <w:rPr>
-          <w:sz w:val="20"/>
-        </w:rPr>
-        <w:t>ҳолда</w:t>
-      </w:r>
-      <w:r>
-        <w:rPr>
-          <w:spacing w:val="-11"/>
-          <w:sz w:val="20"/>
-        </w:rPr>
-        <w:t xml:space="preserve"> </w:t>
-      </w:r>
-      <w:r>
-        <w:rPr>
-          <w:sz w:val="20"/>
-        </w:rPr>
-        <w:t>ўчирилиши</w:t>
-      </w:r>
-      <w:r>
-        <w:rPr>
-          <w:spacing w:val="-11"/>
-          <w:sz w:val="20"/>
-        </w:rPr>
-        <w:t xml:space="preserve"> </w:t>
-      </w:r>
-      <w:r>
-        <w:rPr>
-          <w:sz w:val="20"/>
-        </w:rPr>
-        <w:t>бундан</w:t>
-      </w:r>
-      <w:r>
-        <w:rPr>
-          <w:spacing w:val="-13"/>
-          <w:sz w:val="20"/>
-        </w:rPr>
-        <w:t xml:space="preserve"> </w:t>
-      </w:r>
-      <w:r>
-        <w:rPr>
-          <w:sz w:val="20"/>
-        </w:rPr>
-        <w:t>мустасно.</w:t>
-      </w:r>
-      <w:r>
-        <w:rPr>
-          <w:spacing w:val="-8"/>
-          <w:sz w:val="20"/>
-        </w:rPr>
-        <w:t xml:space="preserve"> </w:t>
-      </w:r>
-      <w:r>
-        <w:rPr>
-          <w:sz w:val="20"/>
-        </w:rPr>
-        <w:t>Ушбу</w:t>
-      </w:r>
-      <w:r>
-        <w:rPr>
-          <w:spacing w:val="-13"/>
-          <w:sz w:val="20"/>
-        </w:rPr>
-        <w:t xml:space="preserve"> </w:t>
-      </w:r>
-      <w:r>
-        <w:rPr>
-          <w:sz w:val="20"/>
-        </w:rPr>
-        <w:t>ҳолатда</w:t>
-      </w:r>
-      <w:r>
-        <w:rPr>
-          <w:spacing w:val="-9"/>
-          <w:sz w:val="20"/>
-        </w:rPr>
-        <w:t xml:space="preserve"> </w:t>
-      </w:r>
-      <w:r>
-        <w:rPr>
-          <w:sz w:val="20"/>
-        </w:rPr>
-        <w:t>“ИЖАРАГА</w:t>
-      </w:r>
-      <w:r>
-        <w:rPr>
-          <w:spacing w:val="-8"/>
-          <w:sz w:val="20"/>
-        </w:rPr>
-        <w:t xml:space="preserve"> </w:t>
-      </w:r>
-      <w:r>
-        <w:rPr>
-          <w:sz w:val="20"/>
-        </w:rPr>
-        <w:t>ОЛУВЧИ”га</w:t>
-      </w:r>
-      <w:r>
-        <w:rPr>
-          <w:spacing w:val="-11"/>
-          <w:sz w:val="20"/>
-        </w:rPr>
-        <w:t xml:space="preserve"> </w:t>
-      </w:r>
-      <w:r>
-        <w:rPr>
-          <w:sz w:val="20"/>
-        </w:rPr>
-        <w:t>етказилган</w:t>
-      </w:r>
-      <w:r>
-        <w:rPr>
-          <w:spacing w:val="-12"/>
-          <w:sz w:val="20"/>
-        </w:rPr>
-        <w:t xml:space="preserve"> </w:t>
-      </w:r>
-      <w:r>
-        <w:rPr>
-          <w:sz w:val="20"/>
-        </w:rPr>
-        <w:t>зарарга</w:t>
-      </w:r>
-      <w:r>
-        <w:rPr>
-          <w:spacing w:val="-10"/>
-          <w:sz w:val="20"/>
-        </w:rPr>
-        <w:t xml:space="preserve"> </w:t>
-      </w:r>
-      <w:r>
-        <w:rPr>
-          <w:sz w:val="20"/>
-        </w:rPr>
-        <w:t>“ИЖАРАГА</w:t>
-      </w:r>
-      <w:r>
-        <w:rPr>
-          <w:spacing w:val="-14"/>
-          <w:sz w:val="20"/>
-        </w:rPr>
-        <w:t xml:space="preserve"> </w:t>
-      </w:r>
-      <w:r>
-        <w:rPr>
-          <w:sz w:val="20"/>
-        </w:rPr>
-        <w:t>БЕРУВЧИ”</w:t>
+        <w:t>Коммунал тармоқларда авария содир бўлганидан сўнг уч кунлик муддат ичида, санитария-гигиена, коммунал тармоқларда профилактик тадбирлар ўтказилишида олдиндан 2 иш кунида “ИЖАРАГА ОЛУВЧИ” ни оғзаки равишда хабардор қилиш (Электр энергияси марказлаштирилган ҳолда ўчирилиши бундан мустасно. Ушбу ҳолатда “ИЖАРАГА ОЛУВЧИ”га етказилган зарарга “ИЖАРАГА БЕРУВЧИ”</w:t>
       </w:r>
     </w:p>
     <w:p>
@@ -4135,62 +3372,7 @@
           <w:spacing w:val="-4"/>
           <w:sz w:val="20"/>
         </w:rPr>
-        <w:t>Санитария-гигена, ёнғин</w:t>
-      </w:r>
-      <w:r>
-        <w:rPr>
-          <w:spacing w:val="-2"/>
-          <w:sz w:val="20"/>
-        </w:rPr>
-        <w:t xml:space="preserve"> </w:t>
-      </w:r>
-      <w:r>
-        <w:rPr>
-          <w:spacing w:val="-4"/>
-          <w:sz w:val="20"/>
-        </w:rPr>
-        <w:t>хавфсизлиги</w:t>
-      </w:r>
-      <w:r>
-        <w:rPr>
-          <w:spacing w:val="-1"/>
-          <w:sz w:val="20"/>
-        </w:rPr>
-        <w:t xml:space="preserve"> </w:t>
-      </w:r>
-      <w:r>
-        <w:rPr>
-          <w:spacing w:val="-4"/>
-          <w:sz w:val="20"/>
-        </w:rPr>
-        <w:t>қоидаларига</w:t>
-      </w:r>
-      <w:r>
-        <w:rPr>
-          <w:sz w:val="20"/>
-        </w:rPr>
-        <w:t xml:space="preserve"> </w:t>
-      </w:r>
-      <w:r>
-        <w:rPr>
-          <w:spacing w:val="-4"/>
-          <w:sz w:val="20"/>
-        </w:rPr>
-        <w:t>риоя</w:t>
-      </w:r>
-      <w:r>
-        <w:rPr>
-          <w:spacing w:val="2"/>
-          <w:sz w:val="20"/>
-        </w:rPr>
-        <w:t xml:space="preserve"> </w:t>
-      </w:r>
-      <w:r>
-        <w:rPr>
-          <w:spacing w:val="-4"/>
-          <w:sz w:val="20"/>
-        </w:rPr>
-        <w:t>қилиш;</w:t>
+        <w:t>Санитария-гигиена, ёнғин хавфсизлиги қоидаларига риоя қилиш;</w:t>
       </w:r>
     </w:p>
     <w:p>
@@ -4901,270 +4083,7 @@
           <w:b/>
           <w:sz w:val="20"/>
         </w:rPr>
-        <w:t>“ИЖАРАГА</w:t>
-      </w:r>
-      <w:r>
-        <w:rPr>
-          <w:b/>
-          <w:spacing w:val="-5"/>
-          <w:sz w:val="20"/>
-        </w:rPr>
-        <w:t xml:space="preserve"> </w:t>
-      </w:r>
-      <w:r>
-        <w:rPr>
-          <w:b/>
-          <w:sz w:val="20"/>
-        </w:rPr>
-        <w:t>ОЛУВЧИ”</w:t>
-      </w:r>
-      <w:r>
-        <w:rPr>
-          <w:b/>
-          <w:spacing w:val="66"/>
-          <w:sz w:val="20"/>
-        </w:rPr>
-        <w:t xml:space="preserve"> </w:t>
-      </w:r>
-      <w:r>
-        <w:rPr>
-          <w:b/>
-          <w:sz w:val="20"/>
-        </w:rPr>
-        <w:t>ижара</w:t>
-      </w:r>
-      <w:r>
-        <w:rPr>
-          <w:b/>
-          <w:spacing w:val="-7"/>
-          <w:sz w:val="20"/>
-        </w:rPr>
-        <w:t xml:space="preserve"> </w:t>
-      </w:r>
-      <w:r>
-        <w:rPr>
-          <w:b/>
-          <w:sz w:val="20"/>
-        </w:rPr>
-        <w:t>шартномасини</w:t>
-      </w:r>
-      <w:r>
-        <w:rPr>
-          <w:b/>
-          <w:spacing w:val="-7"/>
-          <w:sz w:val="20"/>
-        </w:rPr>
-        <w:t xml:space="preserve"> </w:t>
-      </w:r>
-      <w:r>
-        <w:rPr>
-          <w:b/>
-          <w:sz w:val="20"/>
-        </w:rPr>
-        <w:t>олдиндан</w:t>
-      </w:r>
-      <w:r>
-        <w:rPr>
-          <w:b/>
-          <w:spacing w:val="-7"/>
-          <w:sz w:val="20"/>
-        </w:rPr>
-        <w:t xml:space="preserve"> </w:t>
-      </w:r>
-      <w:r>
-        <w:rPr>
-          <w:b/>
-          <w:sz w:val="20"/>
-        </w:rPr>
-        <w:t>бекор</w:t>
-      </w:r>
-      <w:r>
-        <w:rPr>
-          <w:b/>
-          <w:spacing w:val="-10"/>
-          <w:sz w:val="20"/>
-        </w:rPr>
-        <w:t xml:space="preserve"> </w:t>
-      </w:r>
-      <w:r>
-        <w:rPr>
-          <w:b/>
-          <w:sz w:val="20"/>
-        </w:rPr>
-        <w:t>қилиш</w:t>
-      </w:r>
-      <w:r>
-        <w:rPr>
-          <w:b/>
-          <w:spacing w:val="-2"/>
-          <w:sz w:val="20"/>
-        </w:rPr>
-        <w:t xml:space="preserve"> </w:t>
-      </w:r>
-      <w:r>
-        <w:rPr>
-          <w:b/>
-          <w:sz w:val="20"/>
-        </w:rPr>
-        <w:t>буйича</w:t>
-      </w:r>
-      <w:r>
-        <w:rPr>
-          <w:b/>
-          <w:spacing w:val="-7"/>
-          <w:sz w:val="20"/>
-        </w:rPr>
-        <w:t xml:space="preserve"> </w:t>
-      </w:r>
-      <w:r>
-        <w:rPr>
-          <w:b/>
-          <w:sz w:val="20"/>
-        </w:rPr>
-        <w:t>қарор</w:t>
-      </w:r>
-      <w:r>
-        <w:rPr>
-          <w:b/>
-          <w:spacing w:val="-10"/>
-          <w:sz w:val="20"/>
-        </w:rPr>
-        <w:t xml:space="preserve"> </w:t>
-      </w:r>
-      <w:r>
-        <w:rPr>
-          <w:b/>
-          <w:sz w:val="20"/>
-        </w:rPr>
-        <w:t>қилган</w:t>
-      </w:r>
-      <w:r>
-        <w:rPr>
-          <w:b/>
-          <w:spacing w:val="-7"/>
-          <w:sz w:val="20"/>
-        </w:rPr>
-        <w:t xml:space="preserve"> </w:t>
-      </w:r>
-      <w:r>
-        <w:rPr>
-          <w:b/>
-          <w:sz w:val="20"/>
-        </w:rPr>
-        <w:t>ҳолда</w:t>
-      </w:r>
-      <w:r>
-        <w:rPr>
-          <w:b/>
-          <w:spacing w:val="-13"/>
-          <w:sz w:val="20"/>
-        </w:rPr>
-        <w:t xml:space="preserve"> </w:t>
-      </w:r>
-      <w:r>
-        <w:rPr>
-          <w:b/>
-          <w:sz w:val="20"/>
-        </w:rPr>
-        <w:t>тўлов</w:t>
-      </w:r>
-      <w:r>
-        <w:rPr>
-          <w:b/>
-          <w:spacing w:val="-11"/>
-          <w:sz w:val="20"/>
-        </w:rPr>
-        <w:t xml:space="preserve"> </w:t>
-      </w:r>
-      <w:r>
-        <w:rPr>
-          <w:b/>
-          <w:sz w:val="20"/>
-        </w:rPr>
-        <w:t>санасига</w:t>
-      </w:r>
-      <w:r>
-        <w:rPr>
-          <w:b/>
-          <w:spacing w:val="-6"/>
-          <w:sz w:val="20"/>
-        </w:rPr>
-        <w:t xml:space="preserve"> </w:t>
-      </w:r>
-      <w:r>
-        <w:rPr>
-          <w:b/>
-          <w:sz w:val="20"/>
-        </w:rPr>
-        <w:t>қадар</w:t>
-      </w:r>
-      <w:r>
-        <w:rPr>
-          <w:b/>
-          <w:spacing w:val="-10"/>
-          <w:sz w:val="20"/>
-        </w:rPr>
-        <w:t xml:space="preserve"> </w:t>
-      </w:r>
-      <w:r>
-        <w:rPr>
-          <w:b/>
-          <w:sz w:val="20"/>
-        </w:rPr>
-        <w:t>10</w:t>
-      </w:r>
-      <w:r>
-        <w:rPr>
-          <w:b/>
-          <w:spacing w:val="-7"/>
-          <w:sz w:val="20"/>
-        </w:rPr>
-        <w:t xml:space="preserve"> </w:t>
-      </w:r>
-      <w:r>
-        <w:rPr>
-          <w:b/>
-          <w:sz w:val="20"/>
-        </w:rPr>
-        <w:t xml:space="preserve">кун </w:t>
-      </w:r>
-      <w:r>
-        <w:rPr>
-          <w:b/>
-          <w:sz w:val="20"/>
-        </w:rPr>
-        <w:lastRenderedPageBreak/>
-        <w:t>олдин</w:t>
-      </w:r>
-      <w:r>
-        <w:rPr>
-          <w:b/>
-          <w:spacing w:val="40"/>
-          <w:sz w:val="20"/>
-        </w:rPr>
-        <w:t xml:space="preserve"> </w:t>
-      </w:r>
-      <w:r>
-        <w:rPr>
-          <w:b/>
-          <w:sz w:val="20"/>
-        </w:rPr>
-        <w:t>“ИЖАРАГА БЕРУВЧИ”ни</w:t>
-      </w:r>
-      <w:r>
-        <w:rPr>
-          <w:b/>
-          <w:spacing w:val="40"/>
-          <w:sz w:val="20"/>
-        </w:rPr>
-        <w:t xml:space="preserve"> </w:t>
-      </w:r>
-      <w:r>
-        <w:rPr>
-          <w:b/>
-          <w:sz w:val="20"/>
-        </w:rPr>
-        <w:t>огоҳлантириш;</w:t>
+        <w:t>“ИЖАРАГА ОЛУВЧИ” ижара шартномасини олдиндан бекор қилиш бўйича қарор қилган ҳолда тўлов санасига қадар 10 кун олдин “ИЖАРАГА БЕРУВЧИ”ни огоҳлантириш;</w:t>
       </w:r>
     </w:p>
     <w:p>
@@ -5204,19 +4123,7 @@
         <w:rPr>
           <w:spacing w:val="-5"/>
         </w:rPr>
-        <w:t>ТАРАФЛАРНИНГ</w:t>
-      </w:r>
-      <w:r>
-        <w:rPr>
-          <w:spacing w:val="6"/>
-        </w:rPr>
-        <w:t xml:space="preserve"> </w:t>
-      </w:r>
-      <w:r>
-        <w:rPr>
-          <w:spacing w:val="-2"/>
-        </w:rPr>
-        <w:t>ЖАВОБГАРЛИГИ</w:t>
+        <w:t>5. ТАРАФЛАРНИНГ ЖАВОБГАРЛИГИ</w:t>
       </w:r>
     </w:p>
     <w:p>
@@ -5239,176 +4146,7 @@
         <w:rPr>
           <w:sz w:val="20"/>
         </w:rPr>
-        <w:t>Тарафлар</w:t>
-      </w:r>
-      <w:r>
-        <w:rPr>
-          <w:spacing w:val="-13"/>
-          <w:sz w:val="20"/>
-        </w:rPr>
-        <w:t xml:space="preserve"> </w:t>
-      </w:r>
-      <w:r>
-        <w:rPr>
-          <w:sz w:val="20"/>
-        </w:rPr>
-        <w:t>мазкур</w:t>
-      </w:r>
-      <w:r>
-        <w:rPr>
-          <w:spacing w:val="-9"/>
-          <w:sz w:val="20"/>
-        </w:rPr>
-        <w:t xml:space="preserve"> </w:t>
-      </w:r>
-      <w:r>
-        <w:rPr>
-          <w:sz w:val="20"/>
-        </w:rPr>
-        <w:t>шартномага</w:t>
-      </w:r>
-      <w:r>
-        <w:rPr>
-          <w:spacing w:val="-9"/>
-          <w:sz w:val="20"/>
-        </w:rPr>
-        <w:t xml:space="preserve"> </w:t>
-      </w:r>
-      <w:r>
-        <w:rPr>
-          <w:sz w:val="20"/>
-        </w:rPr>
-        <w:t>кўра</w:t>
-      </w:r>
-      <w:r>
-        <w:rPr>
-          <w:spacing w:val="-13"/>
-          <w:sz w:val="20"/>
-        </w:rPr>
-        <w:t xml:space="preserve"> </w:t>
-      </w:r>
-      <w:r>
-        <w:rPr>
-          <w:sz w:val="20"/>
-        </w:rPr>
-        <w:t>ўз</w:t>
-      </w:r>
-      <w:r>
-        <w:rPr>
-          <w:spacing w:val="-11"/>
-          <w:sz w:val="20"/>
-        </w:rPr>
-        <w:t xml:space="preserve"> </w:t>
-      </w:r>
-      <w:r>
-        <w:rPr>
-          <w:sz w:val="20"/>
-        </w:rPr>
-        <w:t>мажбуриятларини</w:t>
-      </w:r>
-      <w:r>
-        <w:rPr>
-          <w:spacing w:val="-5"/>
-          <w:sz w:val="20"/>
-        </w:rPr>
-        <w:t xml:space="preserve"> </w:t>
-      </w:r>
-      <w:r>
-        <w:rPr>
-          <w:sz w:val="20"/>
-        </w:rPr>
-        <w:t>бажармаганлиги</w:t>
-      </w:r>
-      <w:r>
-        <w:rPr>
-          <w:spacing w:val="-13"/>
-          <w:sz w:val="20"/>
-        </w:rPr>
-        <w:t xml:space="preserve"> </w:t>
-      </w:r>
-      <w:r>
-        <w:rPr>
-          <w:sz w:val="20"/>
-        </w:rPr>
-        <w:t>ёки</w:t>
-      </w:r>
-      <w:r>
-        <w:rPr>
-          <w:spacing w:val="-9"/>
-          <w:sz w:val="20"/>
-        </w:rPr>
-        <w:t xml:space="preserve"> </w:t>
-      </w:r>
-      <w:r>
-        <w:rPr>
-          <w:sz w:val="20"/>
-        </w:rPr>
-        <w:t>лозим</w:t>
-      </w:r>
-      <w:r>
-        <w:rPr>
-          <w:spacing w:val="-11"/>
-          <w:sz w:val="20"/>
-        </w:rPr>
-        <w:t xml:space="preserve"> </w:t>
-      </w:r>
-      <w:r>
-        <w:rPr>
-          <w:sz w:val="20"/>
-        </w:rPr>
-        <w:t>даражада</w:t>
-      </w:r>
-      <w:r>
-        <w:rPr>
-          <w:spacing w:val="-13"/>
-          <w:sz w:val="20"/>
-        </w:rPr>
-        <w:t xml:space="preserve"> </w:t>
-      </w:r>
-      <w:r>
-        <w:rPr>
-          <w:sz w:val="20"/>
-        </w:rPr>
-        <w:t>бажармаганлиги</w:t>
-      </w:r>
-      <w:r>
-        <w:rPr>
-          <w:spacing w:val="-8"/>
-          <w:sz w:val="20"/>
-        </w:rPr>
-        <w:t xml:space="preserve"> </w:t>
-      </w:r>
-      <w:r>
-        <w:rPr>
-          <w:sz w:val="20"/>
-        </w:rPr>
-        <w:t>оқибатида</w:t>
-      </w:r>
-      <w:r>
-        <w:rPr>
-          <w:spacing w:val="-9"/>
-          <w:sz w:val="20"/>
-        </w:rPr>
-        <w:t xml:space="preserve"> </w:t>
-      </w:r>
-      <w:r>
-        <w:rPr>
-          <w:sz w:val="20"/>
-        </w:rPr>
-        <w:t>иккинчи</w:t>
-      </w:r>
-      <w:r>
-        <w:rPr>
-          <w:spacing w:val="-12"/>
-          <w:sz w:val="20"/>
-        </w:rPr>
-        <w:t xml:space="preserve"> </w:t>
-      </w:r>
-      <w:r>
-        <w:rPr>
-          <w:sz w:val="20"/>
-        </w:rPr>
-        <w:t>тарафга етказилган моддий зарарни қонунда белгиланган тартибда ва ҳажмда қоплайди.</w:t>
+        <w:t>5.1 Тарафлар мазкур шартномага кўра ўз мажбуриятларини бажармаганлиги ёки лозим даражада бажармаганлиги оқибатида иккинчи тарафга етказилган моддий зарарни қонунда белгиланган тартибда ва ҳажмда қоплайди.</w:t>
       </w:r>
     </w:p>
     <w:p>
@@ -5431,137 +4169,7 @@
         <w:rPr>
           <w:sz w:val="20"/>
         </w:rPr>
-        <w:t>Тарафларнинг</w:t>
-      </w:r>
-      <w:r>
-        <w:rPr>
-          <w:spacing w:val="-13"/>
-          <w:sz w:val="20"/>
-        </w:rPr>
-        <w:t xml:space="preserve"> </w:t>
-      </w:r>
-      <w:r>
-        <w:rPr>
-          <w:sz w:val="20"/>
-        </w:rPr>
-        <w:t>мазкур</w:t>
-      </w:r>
-      <w:r>
-        <w:rPr>
-          <w:spacing w:val="-12"/>
-          <w:sz w:val="20"/>
-        </w:rPr>
-        <w:t xml:space="preserve"> </w:t>
-      </w:r>
-      <w:r>
-        <w:rPr>
-          <w:sz w:val="20"/>
-        </w:rPr>
-        <w:t>шартномада</w:t>
-      </w:r>
-      <w:r>
-        <w:rPr>
-          <w:spacing w:val="-13"/>
-          <w:sz w:val="20"/>
-        </w:rPr>
-        <w:t xml:space="preserve"> </w:t>
-      </w:r>
-      <w:r>
-        <w:rPr>
-          <w:sz w:val="20"/>
-        </w:rPr>
-        <w:t>кўрсатилмаган</w:t>
-      </w:r>
-      <w:r>
-        <w:rPr>
-          <w:spacing w:val="-12"/>
-          <w:sz w:val="20"/>
-        </w:rPr>
-        <w:t xml:space="preserve"> </w:t>
-      </w:r>
-      <w:r>
-        <w:rPr>
-          <w:sz w:val="20"/>
-        </w:rPr>
-        <w:t>мулкий</w:t>
-      </w:r>
-      <w:r>
-        <w:rPr>
-          <w:spacing w:val="-13"/>
-          <w:sz w:val="20"/>
-        </w:rPr>
-        <w:t xml:space="preserve"> </w:t>
-      </w:r>
-      <w:r>
-        <w:rPr>
-          <w:sz w:val="20"/>
-        </w:rPr>
-        <w:t>жавобгарликлари</w:t>
-      </w:r>
-      <w:r>
-        <w:rPr>
-          <w:spacing w:val="-12"/>
-          <w:sz w:val="20"/>
-        </w:rPr>
-        <w:t xml:space="preserve"> </w:t>
-      </w:r>
-      <w:r>
-        <w:rPr>
-          <w:sz w:val="20"/>
-        </w:rPr>
-        <w:t>Ўзбекистон</w:t>
-      </w:r>
-      <w:r>
-        <w:rPr>
-          <w:spacing w:val="-13"/>
-          <w:sz w:val="20"/>
-        </w:rPr>
-        <w:t xml:space="preserve"> </w:t>
-      </w:r>
-      <w:r>
-        <w:rPr>
-          <w:sz w:val="20"/>
-        </w:rPr>
-        <w:t>Республикасининг</w:t>
-      </w:r>
-      <w:r>
-        <w:rPr>
-          <w:spacing w:val="-12"/>
-          <w:sz w:val="20"/>
-        </w:rPr>
-        <w:t xml:space="preserve"> </w:t>
-      </w:r>
-      <w:r>
-        <w:rPr>
-          <w:sz w:val="20"/>
-        </w:rPr>
-        <w:t>амалдаги</w:t>
-      </w:r>
-      <w:r>
-        <w:rPr>
-          <w:spacing w:val="-13"/>
-          <w:sz w:val="20"/>
-        </w:rPr>
-        <w:t xml:space="preserve"> </w:t>
-      </w:r>
-      <w:r>
-        <w:rPr>
-          <w:sz w:val="20"/>
-        </w:rPr>
-        <w:t>қонунлари</w:t>
-      </w:r>
-      <w:r>
-        <w:rPr>
-          <w:spacing w:val="-12"/>
-          <w:sz w:val="20"/>
-        </w:rPr>
-        <w:t xml:space="preserve"> </w:t>
-      </w:r>
-      <w:r>
-        <w:rPr>
-          <w:sz w:val="20"/>
-        </w:rPr>
-        <w:t>билан тартибга солинади.</w:t>
+        <w:t>5.2 Тарафларнинг мазкур шартномада кўрсатилмаган мулкий жавобгарликлари Ўзбекистон Республикасининг амалдаги қонунлари билан тартибга солинади.</w:t>
       </w:r>
     </w:p>
     <w:p>
@@ -5584,189 +4192,7 @@
         <w:rPr>
           <w:sz w:val="20"/>
         </w:rPr>
-        <w:t>Барча</w:t>
-      </w:r>
-      <w:r>
-        <w:rPr>
-          <w:spacing w:val="-13"/>
-          <w:sz w:val="20"/>
-        </w:rPr>
-        <w:t xml:space="preserve"> </w:t>
-      </w:r>
-      <w:r>
-        <w:rPr>
-          <w:sz w:val="20"/>
-        </w:rPr>
-        <w:t>эътирозлар</w:t>
-      </w:r>
-      <w:r>
-        <w:rPr>
-          <w:spacing w:val="-7"/>
-          <w:sz w:val="20"/>
-        </w:rPr>
-        <w:t xml:space="preserve"> </w:t>
-      </w:r>
-      <w:r>
-        <w:rPr>
-          <w:sz w:val="20"/>
-        </w:rPr>
-        <w:t>ва</w:t>
-      </w:r>
-      <w:r>
-        <w:rPr>
-          <w:spacing w:val="-13"/>
-          <w:sz w:val="20"/>
-        </w:rPr>
-        <w:t xml:space="preserve"> </w:t>
-      </w:r>
-      <w:r>
-        <w:rPr>
-          <w:sz w:val="20"/>
-        </w:rPr>
-        <w:t>келишмовчиликлар</w:t>
-      </w:r>
-      <w:r>
-        <w:rPr>
-          <w:spacing w:val="-7"/>
-          <w:sz w:val="20"/>
-        </w:rPr>
-        <w:t xml:space="preserve"> </w:t>
-      </w:r>
-      <w:r>
-        <w:rPr>
-          <w:sz w:val="20"/>
-        </w:rPr>
-        <w:t>музокаралар</w:t>
-      </w:r>
-      <w:r>
-        <w:rPr>
-          <w:spacing w:val="-6"/>
-          <w:sz w:val="20"/>
-        </w:rPr>
-        <w:t xml:space="preserve"> </w:t>
-      </w:r>
-      <w:r>
-        <w:rPr>
-          <w:sz w:val="20"/>
-        </w:rPr>
-        <w:t>йўли</w:t>
-      </w:r>
-      <w:r>
-        <w:rPr>
-          <w:spacing w:val="-10"/>
-          <w:sz w:val="20"/>
-        </w:rPr>
-        <w:t xml:space="preserve"> </w:t>
-      </w:r>
-      <w:r>
-        <w:rPr>
-          <w:sz w:val="20"/>
-        </w:rPr>
-        <w:t>билан</w:t>
-      </w:r>
-      <w:r>
-        <w:rPr>
-          <w:spacing w:val="-12"/>
-          <w:sz w:val="20"/>
-        </w:rPr>
-        <w:t xml:space="preserve"> </w:t>
-      </w:r>
-      <w:r>
-        <w:rPr>
-          <w:sz w:val="20"/>
-        </w:rPr>
-        <w:t>ҳал</w:t>
-      </w:r>
-      <w:r>
-        <w:rPr>
-          <w:spacing w:val="-12"/>
-          <w:sz w:val="20"/>
-        </w:rPr>
-        <w:t xml:space="preserve"> </w:t>
-      </w:r>
-      <w:r>
-        <w:rPr>
-          <w:sz w:val="20"/>
-        </w:rPr>
-        <w:t>қилинади.</w:t>
-      </w:r>
-      <w:r>
-        <w:rPr>
-          <w:spacing w:val="-9"/>
-          <w:sz w:val="20"/>
-        </w:rPr>
-        <w:t xml:space="preserve"> </w:t>
-      </w:r>
-      <w:r>
-        <w:rPr>
-          <w:sz w:val="20"/>
-        </w:rPr>
-        <w:t>Тарафлар</w:t>
-      </w:r>
-      <w:r>
-        <w:rPr>
-          <w:spacing w:val="-10"/>
-          <w:sz w:val="20"/>
-        </w:rPr>
-        <w:t xml:space="preserve"> </w:t>
-      </w:r>
-      <w:r>
-        <w:rPr>
-          <w:sz w:val="20"/>
-        </w:rPr>
-        <w:t>ўртасида</w:t>
-      </w:r>
-      <w:r>
-        <w:rPr>
-          <w:spacing w:val="-13"/>
-          <w:sz w:val="20"/>
-        </w:rPr>
-        <w:t xml:space="preserve"> </w:t>
-      </w:r>
-      <w:r>
-        <w:rPr>
-          <w:sz w:val="20"/>
-        </w:rPr>
-        <w:t>келишувга</w:t>
-      </w:r>
-      <w:r>
-        <w:rPr>
-          <w:spacing w:val="-12"/>
-          <w:sz w:val="20"/>
-        </w:rPr>
-        <w:t xml:space="preserve"> </w:t>
-      </w:r>
-      <w:r>
-        <w:rPr>
-          <w:sz w:val="20"/>
-        </w:rPr>
-        <w:t>эришилмаган</w:t>
-      </w:r>
-      <w:r>
-        <w:rPr>
-          <w:spacing w:val="-11"/>
-          <w:sz w:val="20"/>
-        </w:rPr>
-        <w:t xml:space="preserve"> </w:t>
-      </w:r>
-      <w:r>
-        <w:rPr>
-          <w:sz w:val="20"/>
-        </w:rPr>
-        <w:t>тақдирда</w:t>
-      </w:r>
-      <w:r>
-        <w:rPr>
-          <w:spacing w:val="-13"/>
-          <w:sz w:val="20"/>
-        </w:rPr>
-        <w:t xml:space="preserve"> </w:t>
-      </w:r>
-      <w:r>
-        <w:rPr>
-          <w:sz w:val="20"/>
-        </w:rPr>
-        <w:t>низо “ИЖАРАГА БЕРУВЧИ” жойлашган судда ҳал қилинади.</w:t>
+        <w:t>5.3 Барча эътирозлар ва келишмовчиликлар музокаралар йўли билан ҳал қилинади. Тарафлар ўртасида келишувга эришилмаган тақдирда низо “ИЖАРАГА БЕРУВЧИ” жойлашган судда ҳал қилинади.</w:t>
       </w:r>
     </w:p>
     <w:p>
@@ -5790,159 +4216,7 @@
           <w:spacing w:val="-4"/>
           <w:sz w:val="20"/>
         </w:rPr>
-        <w:t>Ушбу</w:t>
-      </w:r>
-      <w:r>
-        <w:rPr>
-          <w:spacing w:val="-6"/>
-          <w:sz w:val="20"/>
-        </w:rPr>
-        <w:t xml:space="preserve"> </w:t>
-      </w:r>
-      <w:r>
-        <w:rPr>
-          <w:spacing w:val="-4"/>
-          <w:sz w:val="20"/>
-        </w:rPr>
-        <w:t>шартнома</w:t>
-      </w:r>
-      <w:r>
-        <w:rPr>
-          <w:sz w:val="20"/>
-        </w:rPr>
-        <w:t xml:space="preserve"> </w:t>
-      </w:r>
-      <w:r>
-        <w:rPr>
-          <w:spacing w:val="-4"/>
-          <w:sz w:val="20"/>
-        </w:rPr>
-        <w:t>шартлари</w:t>
-      </w:r>
-      <w:r>
-        <w:rPr>
-          <w:spacing w:val="-2"/>
-          <w:sz w:val="20"/>
-        </w:rPr>
-        <w:t xml:space="preserve"> </w:t>
-      </w:r>
-      <w:r>
-        <w:rPr>
-          <w:spacing w:val="-4"/>
-          <w:sz w:val="20"/>
-        </w:rPr>
-        <w:t>тўлик</w:t>
-      </w:r>
-      <w:r>
-        <w:rPr>
-          <w:spacing w:val="2"/>
-          <w:sz w:val="20"/>
-        </w:rPr>
-        <w:t xml:space="preserve"> </w:t>
-      </w:r>
-      <w:r>
-        <w:rPr>
-          <w:spacing w:val="-4"/>
-          <w:sz w:val="20"/>
-        </w:rPr>
-        <w:t>бажарилмаган</w:t>
-      </w:r>
-      <w:r>
-        <w:rPr>
-          <w:spacing w:val="2"/>
-          <w:sz w:val="20"/>
-        </w:rPr>
-        <w:t xml:space="preserve"> </w:t>
-      </w:r>
-      <w:r>
-        <w:rPr>
-          <w:spacing w:val="-4"/>
-          <w:sz w:val="20"/>
-        </w:rPr>
-        <w:t>тақдирда</w:t>
-      </w:r>
-      <w:r>
-        <w:rPr>
-          <w:spacing w:val="7"/>
-          <w:sz w:val="20"/>
-        </w:rPr>
-        <w:t xml:space="preserve"> </w:t>
-      </w:r>
-      <w:r>
-        <w:rPr>
-          <w:spacing w:val="-4"/>
-          <w:sz w:val="20"/>
-        </w:rPr>
-        <w:t>солиштирма</w:t>
-      </w:r>
-      <w:r>
-        <w:rPr>
-          <w:sz w:val="20"/>
-        </w:rPr>
-        <w:t xml:space="preserve"> </w:t>
-      </w:r>
-      <w:r>
-        <w:rPr>
-          <w:spacing w:val="-4"/>
-          <w:sz w:val="20"/>
-        </w:rPr>
-        <w:t>далолатномасиз</w:t>
-      </w:r>
-      <w:r>
-        <w:rPr>
-          <w:spacing w:val="5"/>
-          <w:sz w:val="20"/>
-        </w:rPr>
-        <w:t xml:space="preserve"> </w:t>
-      </w:r>
-      <w:r>
-        <w:rPr>
-          <w:spacing w:val="-4"/>
-          <w:sz w:val="20"/>
-        </w:rPr>
-        <w:t>иқтисодий</w:t>
-      </w:r>
-      <w:r>
-        <w:rPr>
-          <w:spacing w:val="-2"/>
-          <w:sz w:val="20"/>
-        </w:rPr>
-        <w:t xml:space="preserve"> </w:t>
-      </w:r>
-      <w:r>
-        <w:rPr>
-          <w:spacing w:val="-4"/>
-          <w:sz w:val="20"/>
-        </w:rPr>
-        <w:t>судга</w:t>
-      </w:r>
-      <w:r>
-        <w:rPr>
-          <w:spacing w:val="1"/>
-          <w:sz w:val="20"/>
-        </w:rPr>
-        <w:t xml:space="preserve"> </w:t>
-      </w:r>
-      <w:r>
-        <w:rPr>
-          <w:spacing w:val="-4"/>
-          <w:sz w:val="20"/>
-        </w:rPr>
-        <w:t>мурожаат</w:t>
-      </w:r>
-      <w:r>
-        <w:rPr>
-          <w:spacing w:val="3"/>
-          <w:sz w:val="20"/>
-        </w:rPr>
-        <w:t xml:space="preserve"> </w:t>
-      </w:r>
-      <w:r>
-        <w:rPr>
-          <w:spacing w:val="-4"/>
-          <w:sz w:val="20"/>
-        </w:rPr>
-        <w:t>қилинади.</w:t>
+        <w:t>5.4 Ушбу шартнома шартлари тўлиқ бажарилмаган тақдирда солиштирма далолатномасиз иқтисодий судга мурожаат қилинади.</w:t>
       </w:r>
     </w:p>
     <w:p>
@@ -5966,229 +4240,7 @@
           <w:spacing w:val="-4"/>
           <w:sz w:val="20"/>
         </w:rPr>
-        <w:t>Мазкур</w:t>
-      </w:r>
-      <w:r>
-        <w:rPr>
-          <w:spacing w:val="-3"/>
-          <w:sz w:val="20"/>
-        </w:rPr>
-        <w:t xml:space="preserve"> </w:t>
-      </w:r>
-      <w:r>
-        <w:rPr>
-          <w:spacing w:val="-4"/>
-          <w:sz w:val="20"/>
-        </w:rPr>
-        <w:t>шартномани</w:t>
-      </w:r>
-      <w:r>
-        <w:rPr>
-          <w:spacing w:val="-3"/>
-          <w:sz w:val="20"/>
-        </w:rPr>
-        <w:t xml:space="preserve"> </w:t>
-      </w:r>
-      <w:r>
-        <w:rPr>
-          <w:spacing w:val="-4"/>
-          <w:sz w:val="20"/>
-        </w:rPr>
-        <w:t>бекор</w:t>
-      </w:r>
-      <w:r>
-        <w:rPr>
-          <w:spacing w:val="3"/>
-          <w:sz w:val="20"/>
-        </w:rPr>
-        <w:t xml:space="preserve"> </w:t>
-      </w:r>
-      <w:r>
-        <w:rPr>
-          <w:spacing w:val="-4"/>
-          <w:sz w:val="20"/>
-        </w:rPr>
-        <w:t>килишга</w:t>
-      </w:r>
-      <w:r>
-        <w:rPr>
-          <w:spacing w:val="3"/>
-          <w:sz w:val="20"/>
-        </w:rPr>
-        <w:t xml:space="preserve"> </w:t>
-      </w:r>
-      <w:r>
-        <w:rPr>
-          <w:spacing w:val="-4"/>
-          <w:sz w:val="20"/>
-        </w:rPr>
-        <w:t>карор</w:t>
-      </w:r>
-      <w:r>
-        <w:rPr>
-          <w:spacing w:val="5"/>
-          <w:sz w:val="20"/>
-        </w:rPr>
-        <w:t xml:space="preserve"> </w:t>
-      </w:r>
-      <w:r>
-        <w:rPr>
-          <w:spacing w:val="-4"/>
-          <w:sz w:val="20"/>
-        </w:rPr>
-        <w:t>килган</w:t>
-      </w:r>
-      <w:r>
-        <w:rPr>
-          <w:spacing w:val="-1"/>
-          <w:sz w:val="20"/>
-        </w:rPr>
-        <w:t xml:space="preserve"> </w:t>
-      </w:r>
-      <w:r>
-        <w:rPr>
-          <w:spacing w:val="-4"/>
-          <w:sz w:val="20"/>
-        </w:rPr>
-        <w:t>тараф</w:t>
-      </w:r>
-      <w:r>
-        <w:rPr>
-          <w:spacing w:val="2"/>
-          <w:sz w:val="20"/>
-        </w:rPr>
-        <w:t xml:space="preserve"> </w:t>
-      </w:r>
-      <w:r>
-        <w:rPr>
-          <w:spacing w:val="-4"/>
-          <w:sz w:val="20"/>
-        </w:rPr>
-        <w:t>иккинчи</w:t>
-      </w:r>
-      <w:r>
-        <w:rPr>
-          <w:spacing w:val="-1"/>
-          <w:sz w:val="20"/>
-        </w:rPr>
-        <w:t xml:space="preserve"> </w:t>
-      </w:r>
-      <w:r>
-        <w:rPr>
-          <w:spacing w:val="-4"/>
-          <w:sz w:val="20"/>
-        </w:rPr>
-        <w:t>тарафга</w:t>
-      </w:r>
-      <w:r>
-        <w:rPr>
-          <w:sz w:val="20"/>
-        </w:rPr>
-        <w:t xml:space="preserve"> </w:t>
-      </w:r>
-      <w:r>
-        <w:rPr>
-          <w:spacing w:val="-4"/>
-          <w:sz w:val="20"/>
-        </w:rPr>
-        <w:t>ўн</w:t>
-      </w:r>
-      <w:r>
-        <w:rPr>
-          <w:spacing w:val="-7"/>
-          <w:sz w:val="20"/>
-        </w:rPr>
-        <w:t xml:space="preserve"> </w:t>
-      </w:r>
-      <w:r>
-        <w:rPr>
-          <w:spacing w:val="-4"/>
-          <w:sz w:val="20"/>
-        </w:rPr>
-        <w:t>кун олдин</w:t>
-      </w:r>
-      <w:r>
-        <w:rPr>
-          <w:spacing w:val="1"/>
-          <w:sz w:val="20"/>
-        </w:rPr>
-        <w:t xml:space="preserve"> </w:t>
-      </w:r>
-      <w:r>
-        <w:rPr>
-          <w:spacing w:val="-4"/>
-          <w:sz w:val="20"/>
-        </w:rPr>
-        <w:t>хат</w:t>
-      </w:r>
-      <w:r>
-        <w:rPr>
-          <w:spacing w:val="1"/>
-          <w:sz w:val="20"/>
-        </w:rPr>
-        <w:t xml:space="preserve"> </w:t>
-      </w:r>
-      <w:r>
-        <w:rPr>
-          <w:spacing w:val="-4"/>
-          <w:sz w:val="20"/>
-        </w:rPr>
-        <w:t>билан</w:t>
-      </w:r>
-      <w:r>
-        <w:rPr>
-          <w:spacing w:val="-7"/>
-          <w:sz w:val="20"/>
-        </w:rPr>
-        <w:t xml:space="preserve"> </w:t>
-      </w:r>
-      <w:r>
-        <w:rPr>
-          <w:spacing w:val="-4"/>
-          <w:sz w:val="20"/>
-        </w:rPr>
-        <w:t>ёзма</w:t>
-      </w:r>
-      <w:r>
-        <w:rPr>
-          <w:sz w:val="20"/>
-        </w:rPr>
-        <w:t xml:space="preserve"> </w:t>
-      </w:r>
-      <w:r>
-        <w:rPr>
-          <w:spacing w:val="-4"/>
-          <w:sz w:val="20"/>
-        </w:rPr>
-        <w:t>билдиришнома</w:t>
-      </w:r>
-      <w:r>
-        <w:rPr>
-          <w:spacing w:val="2"/>
-          <w:sz w:val="20"/>
-        </w:rPr>
-        <w:t xml:space="preserve"> </w:t>
-      </w:r>
-      <w:r>
-        <w:rPr>
-          <w:spacing w:val="-4"/>
-          <w:sz w:val="20"/>
-        </w:rPr>
-        <w:t>юбориши</w:t>
-      </w:r>
-      <w:r>
-        <w:rPr>
-          <w:spacing w:val="-1"/>
-          <w:sz w:val="20"/>
-        </w:rPr>
-        <w:t xml:space="preserve"> </w:t>
-      </w:r>
-      <w:r>
-        <w:rPr>
-          <w:spacing w:val="-4"/>
-          <w:sz w:val="20"/>
-        </w:rPr>
-        <w:t>шарт.</w:t>
+        <w:t>5.5 Мазкур шартномани бекор қилишга қарор қилган тараф иккинчи тарафга ўн кун олдин хат билан ёзма билдиришнома юбориши шарт.</w:t>
       </w:r>
     </w:p>
     <w:p>
@@ -6215,19 +4267,7 @@
         <w:rPr>
           <w:spacing w:val="-5"/>
         </w:rPr>
-        <w:t>ШАРТНОМАНИНГ</w:t>
-      </w:r>
-      <w:r>
-        <w:rPr>
-          <w:spacing w:val="6"/>
-        </w:rPr>
-        <w:t xml:space="preserve"> </w:t>
-      </w:r>
-      <w:r>
-        <w:rPr>
-          <w:spacing w:val="-2"/>
-        </w:rPr>
-        <w:t>МУДДАТИ</w:t>
+        <w:t>6. ШАРТНОМАНИНГ МУДДАТИ</w:t>
       </w:r>
     </w:p>
     <w:p>
@@ -6256,7 +4296,7 @@
           <w:spacing w:val="-2"/>
           <w:sz w:val="20"/>
         </w:rPr>
-        <w:t>Мазкуршартнома {{startDate}} бошлаб қонуний кучга кириб, {{endDate}} кунигача амал қилади. Шартнома тугатилгандан кейин ҳам тўланмай қолган қарздорлик зиммаси бекор қилинмайди.</w:t>
+        <w:t>Мазкур шартнома {{startDate}} бошлаб қонуний кучга кириб, {{endDate}} кунигача амал қилади. Шартнома тугатилгандан кейин ҳам тўланмай қолган қарздорлик зиммаси бекор қилинмайди.</w:t>
       </w:r>
     </w:p>
     <w:p>
@@ -6277,19 +4317,7 @@
         <w:rPr>
           <w:spacing w:val="-5"/>
         </w:rPr>
-        <w:t>ТАРАФЛАРНИНГ</w:t>
-      </w:r>
-      <w:r>
-        <w:rPr>
-          <w:spacing w:val="6"/>
-        </w:rPr>
-        <w:t xml:space="preserve"> </w:t>
-      </w:r>
-      <w:r>
-        <w:rPr>
-          <w:spacing w:val="-2"/>
-        </w:rPr>
-        <w:t>ЖАВОБГАРЛИГИ</w:t>
+        <w:t>7. ЯКУНИЙ ҚОИДАЛАР</w:t>
       </w:r>
     </w:p>
     <w:p>
@@ -6312,163 +4340,7 @@
         <w:rPr>
           <w:sz w:val="20"/>
         </w:rPr>
-        <w:t>Мазкур</w:t>
-      </w:r>
-      <w:r>
-        <w:rPr>
-          <w:spacing w:val="-13"/>
-          <w:sz w:val="20"/>
-        </w:rPr>
-        <w:t xml:space="preserve"> </w:t>
-      </w:r>
-      <w:r>
-        <w:rPr>
-          <w:sz w:val="20"/>
-        </w:rPr>
-        <w:t>шартномага</w:t>
-      </w:r>
-      <w:r>
-        <w:rPr>
-          <w:spacing w:val="-11"/>
-          <w:sz w:val="20"/>
-        </w:rPr>
-        <w:t xml:space="preserve"> </w:t>
-      </w:r>
-      <w:r>
-        <w:rPr>
-          <w:sz w:val="20"/>
-        </w:rPr>
-        <w:t>киритилиши</w:t>
-      </w:r>
-      <w:r>
-        <w:rPr>
-          <w:spacing w:val="-12"/>
-          <w:sz w:val="20"/>
-        </w:rPr>
-        <w:t xml:space="preserve"> </w:t>
-      </w:r>
-      <w:r>
-        <w:rPr>
-          <w:sz w:val="20"/>
-        </w:rPr>
-        <w:t>мумкин</w:t>
-      </w:r>
-      <w:r>
-        <w:rPr>
-          <w:spacing w:val="-11"/>
-          <w:sz w:val="20"/>
-        </w:rPr>
-        <w:t xml:space="preserve"> </w:t>
-      </w:r>
-      <w:r>
-        <w:rPr>
-          <w:sz w:val="20"/>
-        </w:rPr>
-        <w:t>бўлган</w:t>
-      </w:r>
-      <w:r>
-        <w:rPr>
-          <w:spacing w:val="-13"/>
-          <w:sz w:val="20"/>
-        </w:rPr>
-        <w:t xml:space="preserve"> </w:t>
-      </w:r>
-      <w:r>
-        <w:rPr>
-          <w:sz w:val="20"/>
-        </w:rPr>
-        <w:t>барча</w:t>
-      </w:r>
-      <w:r>
-        <w:rPr>
-          <w:spacing w:val="-8"/>
-          <w:sz w:val="20"/>
-        </w:rPr>
-        <w:t xml:space="preserve"> </w:t>
-      </w:r>
-      <w:r>
-        <w:rPr>
-          <w:sz w:val="20"/>
-        </w:rPr>
-        <w:t>қўшимчалар</w:t>
-      </w:r>
-      <w:r>
-        <w:rPr>
-          <w:spacing w:val="-10"/>
-          <w:sz w:val="20"/>
-        </w:rPr>
-        <w:t xml:space="preserve"> </w:t>
-      </w:r>
-      <w:r>
-        <w:rPr>
-          <w:sz w:val="20"/>
-        </w:rPr>
-        <w:t>ва</w:t>
-      </w:r>
-      <w:r>
-        <w:rPr>
-          <w:spacing w:val="-12"/>
-          <w:sz w:val="20"/>
-        </w:rPr>
-        <w:t xml:space="preserve"> </w:t>
-      </w:r>
-      <w:r>
-        <w:rPr>
-          <w:sz w:val="20"/>
-        </w:rPr>
-        <w:t>ўзгартиришлар</w:t>
-      </w:r>
-      <w:r>
-        <w:rPr>
-          <w:spacing w:val="-10"/>
-          <w:sz w:val="20"/>
-        </w:rPr>
-        <w:t xml:space="preserve"> </w:t>
-      </w:r>
-      <w:r>
-        <w:rPr>
-          <w:sz w:val="20"/>
-        </w:rPr>
-        <w:t>ёзма</w:t>
-      </w:r>
-      <w:r>
-        <w:rPr>
-          <w:spacing w:val="-13"/>
-          <w:sz w:val="20"/>
-        </w:rPr>
-        <w:t xml:space="preserve"> </w:t>
-      </w:r>
-      <w:r>
-        <w:rPr>
-          <w:sz w:val="20"/>
-        </w:rPr>
-        <w:t>равишда</w:t>
-      </w:r>
-      <w:r>
-        <w:rPr>
-          <w:spacing w:val="-12"/>
-          <w:sz w:val="20"/>
-        </w:rPr>
-        <w:t xml:space="preserve"> </w:t>
-      </w:r>
-      <w:r>
-        <w:rPr>
-          <w:sz w:val="20"/>
-        </w:rPr>
-        <w:t>расмийлаштирилиб,</w:t>
-      </w:r>
-      <w:r>
-        <w:rPr>
-          <w:spacing w:val="-8"/>
-          <w:sz w:val="20"/>
-        </w:rPr>
-        <w:t xml:space="preserve"> </w:t>
-      </w:r>
-      <w:r>
-        <w:rPr>
-          <w:sz w:val="20"/>
-        </w:rPr>
-        <w:t>тарафларнинг ваколатли шахслари томонидан имзоланганидан сўнг кучга киради ҳамда шартноманинг ажралмас қисми ҳисобланади.</w:t>
+        <w:t>7.1 Мазкур шартномага киритилиши мумкин бўлган барча қўшимчалар ва ўзгартиришлар ёзма равишда расмийлаштирилиб, тарафларнинг ваколатли шахслари томонидан имзоланганидан сўнг кучга киради ҳамда шартноманинг ажралмас қисми ҳисобланади.</w:t>
       </w:r>
     </w:p>
     <w:p>
@@ -6492,187 +4364,7 @@
           <w:spacing w:val="-4"/>
           <w:sz w:val="20"/>
         </w:rPr>
-        <w:t>Мазкур</w:t>
-      </w:r>
-      <w:r>
-        <w:rPr>
-          <w:sz w:val="20"/>
-        </w:rPr>
-        <w:t xml:space="preserve"> </w:t>
-      </w:r>
-      <w:r>
-        <w:rPr>
-          <w:spacing w:val="-4"/>
-          <w:sz w:val="20"/>
-        </w:rPr>
-        <w:t>шартнома</w:t>
-      </w:r>
-      <w:r>
-        <w:rPr>
-          <w:sz w:val="20"/>
-        </w:rPr>
-        <w:t xml:space="preserve"> </w:t>
-      </w:r>
-      <w:r>
-        <w:rPr>
-          <w:spacing w:val="-4"/>
-          <w:sz w:val="20"/>
-        </w:rPr>
-        <w:t>бир</w:t>
-      </w:r>
-      <w:r>
-        <w:rPr>
-          <w:spacing w:val="9"/>
-          <w:sz w:val="20"/>
-        </w:rPr>
-        <w:t xml:space="preserve"> </w:t>
-      </w:r>
-      <w:r>
-        <w:rPr>
-          <w:spacing w:val="-4"/>
-          <w:sz w:val="20"/>
-        </w:rPr>
-        <w:t>хил</w:t>
-      </w:r>
-      <w:r>
-        <w:rPr>
-          <w:spacing w:val="-5"/>
-          <w:sz w:val="20"/>
-        </w:rPr>
-        <w:t xml:space="preserve"> </w:t>
-      </w:r>
-      <w:r>
-        <w:rPr>
-          <w:spacing w:val="-4"/>
-          <w:sz w:val="20"/>
-        </w:rPr>
-        <w:t>юридик</w:t>
-      </w:r>
-      <w:r>
-        <w:rPr>
-          <w:spacing w:val="-1"/>
-          <w:sz w:val="20"/>
-        </w:rPr>
-        <w:t xml:space="preserve"> </w:t>
-      </w:r>
-      <w:r>
-        <w:rPr>
-          <w:spacing w:val="-4"/>
-          <w:sz w:val="20"/>
-        </w:rPr>
-        <w:t>кучга</w:t>
-      </w:r>
-      <w:r>
-        <w:rPr>
-          <w:spacing w:val="1"/>
-          <w:sz w:val="20"/>
-        </w:rPr>
-        <w:t xml:space="preserve"> </w:t>
-      </w:r>
-      <w:r>
-        <w:rPr>
-          <w:spacing w:val="-4"/>
-          <w:sz w:val="20"/>
-        </w:rPr>
-        <w:t>эга</w:t>
-      </w:r>
-      <w:r>
-        <w:rPr>
-          <w:spacing w:val="4"/>
-          <w:sz w:val="20"/>
-        </w:rPr>
-        <w:t xml:space="preserve"> </w:t>
-      </w:r>
-      <w:r>
-        <w:rPr>
-          <w:spacing w:val="-4"/>
-          <w:sz w:val="20"/>
-        </w:rPr>
-        <w:t>бўлган икки</w:t>
-      </w:r>
-      <w:r>
-        <w:rPr>
-          <w:spacing w:val="3"/>
-          <w:sz w:val="20"/>
-        </w:rPr>
-        <w:t xml:space="preserve"> </w:t>
-      </w:r>
-      <w:r>
-        <w:rPr>
-          <w:spacing w:val="-4"/>
-          <w:sz w:val="20"/>
-        </w:rPr>
-        <w:t>нусхада</w:t>
-      </w:r>
-      <w:r>
-        <w:rPr>
-          <w:spacing w:val="5"/>
-          <w:sz w:val="20"/>
-        </w:rPr>
-        <w:t xml:space="preserve"> </w:t>
-      </w:r>
-      <w:r>
-        <w:rPr>
-          <w:spacing w:val="-4"/>
-          <w:sz w:val="20"/>
-        </w:rPr>
-        <w:t>тузилди.</w:t>
-      </w:r>
-      <w:r>
-        <w:rPr>
-          <w:spacing w:val="4"/>
-          <w:sz w:val="20"/>
-        </w:rPr>
-        <w:t xml:space="preserve"> </w:t>
-      </w:r>
-      <w:r>
-        <w:rPr>
-          <w:spacing w:val="-4"/>
-          <w:sz w:val="20"/>
-        </w:rPr>
-        <w:t>Шартнома</w:t>
-      </w:r>
-      <w:r>
-        <w:rPr>
-          <w:spacing w:val="3"/>
-          <w:sz w:val="20"/>
-        </w:rPr>
-        <w:t xml:space="preserve"> </w:t>
-      </w:r>
-      <w:r>
-        <w:rPr>
-          <w:spacing w:val="-4"/>
-          <w:sz w:val="20"/>
-        </w:rPr>
-        <w:t>нусхалари</w:t>
-      </w:r>
-      <w:r>
-        <w:rPr>
-          <w:spacing w:val="-2"/>
-          <w:sz w:val="20"/>
-        </w:rPr>
-        <w:t xml:space="preserve"> </w:t>
-      </w:r>
-      <w:r>
-        <w:rPr>
-          <w:spacing w:val="-4"/>
-          <w:sz w:val="20"/>
-        </w:rPr>
-        <w:t>тарафларга</w:t>
-      </w:r>
-      <w:r>
-        <w:rPr>
-          <w:spacing w:val="2"/>
-          <w:sz w:val="20"/>
-        </w:rPr>
-        <w:t xml:space="preserve"> </w:t>
-      </w:r>
-      <w:r>
-        <w:rPr>
-          <w:spacing w:val="-4"/>
-          <w:sz w:val="20"/>
-        </w:rPr>
-        <w:t>топширилади.</w:t>
+        <w:t>7.2 Мазкур шартнома бир хил юридик кучга эга бўлган икки нусхада тузилди. Шартнома нусхалари тарафларга топширилади.</w:t>
       </w:r>
     </w:p>
     <w:p>
@@ -6706,54 +4398,7 @@
           <w:spacing w:val="-4"/>
           <w:sz w:val="20"/>
         </w:rPr>
-        <w:t>ТАРАФЛАРНИНГ</w:t>
-      </w:r>
-      <w:r>
-        <w:rPr>
-          <w:b/>
-          <w:spacing w:val="-1"/>
-          <w:sz w:val="20"/>
-        </w:rPr>
-        <w:t xml:space="preserve"> </w:t>
-      </w:r>
-      <w:r>
-        <w:rPr>
-          <w:b/>
-          <w:spacing w:val="-4"/>
-          <w:sz w:val="20"/>
-        </w:rPr>
-        <w:t>ЮРИДИК МАНЗИЛИ</w:t>
-      </w:r>
-      <w:r>
-        <w:rPr>
-          <w:b/>
-          <w:sz w:val="20"/>
-        </w:rPr>
-        <w:t xml:space="preserve"> </w:t>
-      </w:r>
-      <w:r>
-        <w:rPr>
-          <w:b/>
-          <w:spacing w:val="-4"/>
-          <w:sz w:val="20"/>
-        </w:rPr>
-        <w:t>ВА</w:t>
-      </w:r>
-      <w:r>
-        <w:rPr>
-          <w:b/>
-          <w:spacing w:val="-1"/>
-          <w:sz w:val="20"/>
-        </w:rPr>
-        <w:t xml:space="preserve"> </w:t>
-      </w:r>
-      <w:r>
-        <w:rPr>
-          <w:b/>
-          <w:spacing w:val="-4"/>
-          <w:sz w:val="20"/>
-        </w:rPr>
-        <w:t>РЕКВИЗИТЛАРИ:</w:t>
+        <w:t>8. ТАРАФЛАРНИНГ ЮРИДИК МАНЗИЛИ ВА РЕКВИЗИТЛАРИ:</w:t>
       </w:r>
     </w:p>
     <w:p>

</xml_diff>